<commit_message>
Pequena correção do trabalho mediante a explicação do professor
</commit_message>
<xml_diff>
--- a/primeiro-trabalho-pt/Word. Sistema de Recuperacao de Documentos Perdidos.docx
+++ b/primeiro-trabalho-pt/Word. Sistema de Recuperacao de Documentos Perdidos.docx
@@ -209,7 +209,7 @@
           <w:sz w:val="28"/>
           <w:szCs w:val="28"/>
         </w:rPr>
-        <w:t>SISTEMA DE RECUPERAÇÃO DE DOCUMENTOS PERDIDOS</w:t>
+        <w:t xml:space="preserve">DESENVOLVIMENTO DE UM </w:t>
       </w:r>
       <w:r>
         <w:rPr>
@@ -218,27 +218,36 @@
           <w:sz w:val="28"/>
           <w:szCs w:val="28"/>
         </w:rPr>
-        <w:t xml:space="preserve"> BASEADO EM OCR</w:t>
-      </w:r>
-    </w:p>
-    <w:p>
-      <w:pPr>
-        <w:spacing w:after="160"/>
-        <w:jc w:val="center"/>
+        <w:t>SISTEMA DE RECUPERAÇÃO DE DOCUMENTOS PERDIDOS</w:t>
+      </w:r>
+      <w:r>
         <w:rPr>
           <w:b/>
           <w:bCs/>
           <w:sz w:val="28"/>
           <w:szCs w:val="28"/>
         </w:rPr>
-      </w:pPr>
-      <w:r>
+        <w:t xml:space="preserve"> BASEADO EM OCR</w:t>
+      </w:r>
+    </w:p>
+    <w:p>
+      <w:pPr>
+        <w:spacing w:after="160"/>
+        <w:jc w:val="center"/>
         <w:rPr>
           <w:b/>
           <w:bCs/>
           <w:sz w:val="28"/>
           <w:szCs w:val="28"/>
         </w:rPr>
+      </w:pPr>
+      <w:r>
+        <w:rPr>
+          <w:b/>
+          <w:bCs/>
+          <w:sz w:val="28"/>
+          <w:szCs w:val="28"/>
+        </w:rPr>
         <w:t>ESTUDO DE CASO: ANGOLA</w:t>
       </w:r>
     </w:p>
@@ -300,7 +309,10 @@
         <w:spacing w:after="160"/>
       </w:pPr>
       <w:r>
-        <w:t>Nº: S/N</w:t>
+        <w:t xml:space="preserve">Nº: </w:t>
+      </w:r>
+      <w:r>
+        <w:t>5</w:t>
       </w:r>
     </w:p>
     <w:p>
@@ -441,7 +453,7 @@
           <w:r>
             <w:fldChar w:fldCharType="separate"/>
           </w:r>
-          <w:hyperlink w:anchor="_Toc243338246" w:history="1">
+          <w:hyperlink w:anchor="_Toc243895925" w:history="1">
             <w:r>
               <w:rPr>
                 <w:rStyle w:val="Hyperlink"/>
@@ -464,7 +476,7 @@
               <w:rPr>
                 <w:webHidden/>
               </w:rPr>
-              <w:instrText xml:space="preserve"> PAGEREF _Toc243338246 \h </w:instrText>
+              <w:instrText xml:space="preserve"> PAGEREF _Toc243895925 \h </w:instrText>
             </w:r>
             <w:r>
               <w:rPr>
@@ -504,7 +516,7 @@
               <w14:ligatures w14:val="standardContextual"/>
             </w:rPr>
           </w:pPr>
-          <w:hyperlink w:anchor="_Toc243338247" w:history="1">
+          <w:hyperlink w:anchor="_Toc243895926" w:history="1">
             <w:r>
               <w:rPr>
                 <w:rStyle w:val="Hyperlink"/>
@@ -527,7 +539,7 @@
               <w:rPr>
                 <w:webHidden/>
               </w:rPr>
-              <w:instrText xml:space="preserve"> PAGEREF _Toc243338247 \h </w:instrText>
+              <w:instrText xml:space="preserve"> PAGEREF _Toc243895926 \h </w:instrText>
             </w:r>
             <w:r>
               <w:rPr>
@@ -567,12 +579,12 @@
               <w14:ligatures w14:val="standardContextual"/>
             </w:rPr>
           </w:pPr>
-          <w:hyperlink w:anchor="_Toc243338248" w:history="1">
+          <w:hyperlink w:anchor="_Toc243895927" w:history="1">
             <w:r>
               <w:rPr>
                 <w:rStyle w:val="Hyperlink"/>
               </w:rPr>
-              <w:t>3. HIPÓTESES</w:t>
+              <w:t>3. PERGUNTA DE PESQUISA</w:t>
             </w:r>
             <w:r>
               <w:rPr>
@@ -590,7 +602,7 @@
               <w:rPr>
                 <w:webHidden/>
               </w:rPr>
-              <w:instrText xml:space="preserve"> PAGEREF _Toc243338248 \h </w:instrText>
+              <w:instrText xml:space="preserve"> PAGEREF _Toc243895927 \h </w:instrText>
             </w:r>
             <w:r>
               <w:rPr>
@@ -630,12 +642,12 @@
               <w14:ligatures w14:val="standardContextual"/>
             </w:rPr>
           </w:pPr>
-          <w:hyperlink w:anchor="_Toc243338249" w:history="1">
+          <w:hyperlink w:anchor="_Toc243895928" w:history="1">
             <w:r>
               <w:rPr>
                 <w:rStyle w:val="Hyperlink"/>
               </w:rPr>
-              <w:t>4. PERGUNTA DE PESQUISA</w:t>
+              <w:t>4. HIPÓTESES</w:t>
             </w:r>
             <w:r>
               <w:rPr>
@@ -653,7 +665,7 @@
               <w:rPr>
                 <w:webHidden/>
               </w:rPr>
-              <w:instrText xml:space="preserve"> PAGEREF _Toc243338249 \h </w:instrText>
+              <w:instrText xml:space="preserve"> PAGEREF _Toc243895928 \h </w:instrText>
             </w:r>
             <w:r>
               <w:rPr>
@@ -693,12 +705,12 @@
               <w14:ligatures w14:val="standardContextual"/>
             </w:rPr>
           </w:pPr>
-          <w:hyperlink w:anchor="_Toc243338250" w:history="1">
+          <w:hyperlink w:anchor="_Toc243895929" w:history="1">
             <w:r>
               <w:rPr>
                 <w:rStyle w:val="Hyperlink"/>
               </w:rPr>
-              <w:t>5. JUSTIFICATIVA</w:t>
+              <w:t>5. OBJETIVOS</w:t>
             </w:r>
             <w:r>
               <w:rPr>
@@ -716,7 +728,7 @@
               <w:rPr>
                 <w:webHidden/>
               </w:rPr>
-              <w:instrText xml:space="preserve"> PAGEREF _Toc243338250 \h </w:instrText>
+              <w:instrText xml:space="preserve"> PAGEREF _Toc243895929 \h </w:instrText>
             </w:r>
             <w:r>
               <w:rPr>
@@ -734,69 +746,6 @@
                 <w:webHidden/>
               </w:rPr>
               <w:t>4</w:t>
-            </w:r>
-            <w:r>
-              <w:rPr>
-                <w:webHidden/>
-              </w:rPr>
-              <w:fldChar w:fldCharType="end"/>
-            </w:r>
-          </w:hyperlink>
-        </w:p>
-        <w:p>
-          <w:pPr>
-            <w:pStyle w:val="Sumrio1"/>
-            <w:rPr>
-              <w:rFonts w:asciiTheme="minorHAnsi" w:eastAsiaTheme="minorEastAsia" w:hAnsiTheme="minorHAnsi" w:cstheme="minorBidi"/>
-              <w:b w:val="0"/>
-              <w:bCs w:val="0"/>
-              <w:kern w:val="2"/>
-              <w:sz w:val="24"/>
-              <w:szCs w:val="24"/>
-              <w14:ligatures w14:val="standardContextual"/>
-            </w:rPr>
-          </w:pPr>
-          <w:hyperlink w:anchor="_Toc243338251" w:history="1">
-            <w:r>
-              <w:rPr>
-                <w:rStyle w:val="Hyperlink"/>
-              </w:rPr>
-              <w:t>6. OBJETIVOS</w:t>
-            </w:r>
-            <w:r>
-              <w:rPr>
-                <w:webHidden/>
-              </w:rPr>
-              <w:tab/>
-            </w:r>
-            <w:r>
-              <w:rPr>
-                <w:webHidden/>
-              </w:rPr>
-              <w:fldChar w:fldCharType="begin"/>
-            </w:r>
-            <w:r>
-              <w:rPr>
-                <w:webHidden/>
-              </w:rPr>
-              <w:instrText xml:space="preserve"> PAGEREF _Toc243338251 \h </w:instrText>
-            </w:r>
-            <w:r>
-              <w:rPr>
-                <w:webHidden/>
-              </w:rPr>
-            </w:r>
-            <w:r>
-              <w:rPr>
-                <w:webHidden/>
-              </w:rPr>
-              <w:fldChar w:fldCharType="separate"/>
-            </w:r>
-            <w:r>
-              <w:rPr>
-                <w:webHidden/>
-              </w:rPr>
-              <w:t>5</w:t>
             </w:r>
             <w:r>
               <w:rPr>
@@ -821,7 +770,7 @@
               <w14:ligatures w14:val="standardContextual"/>
             </w:rPr>
           </w:pPr>
-          <w:hyperlink w:anchor="_Toc243338252" w:history="1">
+          <w:hyperlink w:anchor="_Toc243895930" w:history="1">
             <w:r>
               <w:rPr>
                 <w:rStyle w:val="Hyperlink"/>
@@ -848,7 +797,7 @@
                 <w:noProof/>
                 <w:webHidden/>
               </w:rPr>
-              <w:instrText xml:space="preserve"> PAGEREF _Toc243338252 \h </w:instrText>
+              <w:instrText xml:space="preserve"> PAGEREF _Toc243895930 \h </w:instrText>
             </w:r>
             <w:r>
               <w:rPr>
@@ -868,7 +817,7 @@
                 <w:noProof/>
                 <w:webHidden/>
               </w:rPr>
-              <w:t>5</w:t>
+              <w:t>4</w:t>
             </w:r>
             <w:r>
               <w:rPr>
@@ -894,7 +843,7 @@
               <w14:ligatures w14:val="standardContextual"/>
             </w:rPr>
           </w:pPr>
-          <w:hyperlink w:anchor="_Toc243338253" w:history="1">
+          <w:hyperlink w:anchor="_Toc243895931" w:history="1">
             <w:r>
               <w:rPr>
                 <w:rStyle w:val="Hyperlink"/>
@@ -921,7 +870,7 @@
                 <w:noProof/>
                 <w:webHidden/>
               </w:rPr>
-              <w:instrText xml:space="preserve"> PAGEREF _Toc243338253 \h </w:instrText>
+              <w:instrText xml:space="preserve"> PAGEREF _Toc243895931 \h </w:instrText>
             </w:r>
             <w:r>
               <w:rPr>
@@ -941,7 +890,7 @@
                 <w:noProof/>
                 <w:webHidden/>
               </w:rPr>
-              <w:t>5</w:t>
+              <w:t>4</w:t>
             </w:r>
             <w:r>
               <w:rPr>
@@ -965,11 +914,74 @@
               <w14:ligatures w14:val="standardContextual"/>
             </w:rPr>
           </w:pPr>
-          <w:hyperlink w:anchor="_Toc243338254" w:history="1">
+          <w:hyperlink w:anchor="_Toc243895932" w:history="1">
             <w:r>
               <w:rPr>
                 <w:rStyle w:val="Hyperlink"/>
               </w:rPr>
+              <w:t>6. JUSTIFICATIVA</w:t>
+            </w:r>
+            <w:r>
+              <w:rPr>
+                <w:webHidden/>
+              </w:rPr>
+              <w:tab/>
+            </w:r>
+            <w:r>
+              <w:rPr>
+                <w:webHidden/>
+              </w:rPr>
+              <w:fldChar w:fldCharType="begin"/>
+            </w:r>
+            <w:r>
+              <w:rPr>
+                <w:webHidden/>
+              </w:rPr>
+              <w:instrText xml:space="preserve"> PAGEREF _Toc243895932 \h </w:instrText>
+            </w:r>
+            <w:r>
+              <w:rPr>
+                <w:webHidden/>
+              </w:rPr>
+            </w:r>
+            <w:r>
+              <w:rPr>
+                <w:webHidden/>
+              </w:rPr>
+              <w:fldChar w:fldCharType="separate"/>
+            </w:r>
+            <w:r>
+              <w:rPr>
+                <w:webHidden/>
+              </w:rPr>
+              <w:t>5</w:t>
+            </w:r>
+            <w:r>
+              <w:rPr>
+                <w:webHidden/>
+              </w:rPr>
+              <w:fldChar w:fldCharType="end"/>
+            </w:r>
+          </w:hyperlink>
+        </w:p>
+        <w:p>
+          <w:pPr>
+            <w:pStyle w:val="Sumrio1"/>
+            <w:rPr>
+              <w:rFonts w:asciiTheme="minorHAnsi" w:eastAsiaTheme="minorEastAsia" w:hAnsiTheme="minorHAnsi" w:cstheme="minorBidi"/>
+              <w:b w:val="0"/>
+              <w:bCs w:val="0"/>
+              <w:kern w:val="2"/>
+              <w:sz w:val="24"/>
+              <w:szCs w:val="24"/>
+              <w14:ligatures w14:val="standardContextual"/>
+            </w:rPr>
+          </w:pPr>
+          <w:hyperlink w:anchor="_Toc243895933" w:history="1">
+            <w:r>
+              <w:rPr>
+                <w:rStyle w:val="Hyperlink"/>
+              </w:rPr>
               <w:t>7. ESTUDO COMPARATIVO DAS TECNOLOGIAS</w:t>
             </w:r>
             <w:r>
@@ -988,7 +1000,7 @@
               <w:rPr>
                 <w:webHidden/>
               </w:rPr>
-              <w:instrText xml:space="preserve"> PAGEREF _Toc243338254 \h </w:instrText>
+              <w:instrText xml:space="preserve"> PAGEREF _Toc243895933 \h </w:instrText>
             </w:r>
             <w:r>
               <w:rPr>
@@ -1030,7 +1042,7 @@
               <w14:ligatures w14:val="standardContextual"/>
             </w:rPr>
           </w:pPr>
-          <w:hyperlink w:anchor="_Toc243338255" w:history="1">
+          <w:hyperlink w:anchor="_Toc243895934" w:history="1">
             <w:r>
               <w:rPr>
                 <w:rStyle w:val="Hyperlink"/>
@@ -1057,7 +1069,7 @@
                 <w:noProof/>
                 <w:webHidden/>
               </w:rPr>
-              <w:instrText xml:space="preserve"> PAGEREF _Toc243338255 \h </w:instrText>
+              <w:instrText xml:space="preserve"> PAGEREF _Toc243895934 \h </w:instrText>
             </w:r>
             <w:r>
               <w:rPr>
@@ -1103,7 +1115,7 @@
               <w14:ligatures w14:val="standardContextual"/>
             </w:rPr>
           </w:pPr>
-          <w:hyperlink w:anchor="_Toc243338256" w:history="1">
+          <w:hyperlink w:anchor="_Toc243895935" w:history="1">
             <w:r>
               <w:rPr>
                 <w:rStyle w:val="Hyperlink"/>
@@ -1130,7 +1142,7 @@
                 <w:noProof/>
                 <w:webHidden/>
               </w:rPr>
-              <w:instrText xml:space="preserve"> PAGEREF _Toc243338256 \h </w:instrText>
+              <w:instrText xml:space="preserve"> PAGEREF _Toc243895935 \h </w:instrText>
             </w:r>
             <w:r>
               <w:rPr>
@@ -1176,7 +1188,7 @@
               <w14:ligatures w14:val="standardContextual"/>
             </w:rPr>
           </w:pPr>
-          <w:hyperlink w:anchor="_Toc243338257" w:history="1">
+          <w:hyperlink w:anchor="_Toc243895936" w:history="1">
             <w:r>
               <w:rPr>
                 <w:rStyle w:val="Hyperlink"/>
@@ -1203,7 +1215,7 @@
                 <w:noProof/>
                 <w:webHidden/>
               </w:rPr>
-              <w:instrText xml:space="preserve"> PAGEREF _Toc243338257 \h </w:instrText>
+              <w:instrText xml:space="preserve"> PAGEREF _Toc243895936 \h </w:instrText>
             </w:r>
             <w:r>
               <w:rPr>
@@ -1249,7 +1261,7 @@
               <w14:ligatures w14:val="standardContextual"/>
             </w:rPr>
           </w:pPr>
-          <w:hyperlink w:anchor="_Toc243338258" w:history="1">
+          <w:hyperlink w:anchor="_Toc243895937" w:history="1">
             <w:r>
               <w:rPr>
                 <w:rStyle w:val="Hyperlink"/>
@@ -1276,7 +1288,7 @@
                 <w:noProof/>
                 <w:webHidden/>
               </w:rPr>
-              <w:instrText xml:space="preserve"> PAGEREF _Toc243338258 \h </w:instrText>
+              <w:instrText xml:space="preserve"> PAGEREF _Toc243895937 \h </w:instrText>
             </w:r>
             <w:r>
               <w:rPr>
@@ -1322,7 +1334,7 @@
               <w14:ligatures w14:val="standardContextual"/>
             </w:rPr>
           </w:pPr>
-          <w:hyperlink w:anchor="_Toc243338259" w:history="1">
+          <w:hyperlink w:anchor="_Toc243895938" w:history="1">
             <w:r>
               <w:rPr>
                 <w:rStyle w:val="Hyperlink"/>
@@ -1349,7 +1361,7 @@
                 <w:noProof/>
                 <w:webHidden/>
               </w:rPr>
-              <w:instrText xml:space="preserve"> PAGEREF _Toc243338259 \h </w:instrText>
+              <w:instrText xml:space="preserve"> PAGEREF _Toc243895938 \h </w:instrText>
             </w:r>
             <w:r>
               <w:rPr>
@@ -1393,7 +1405,7 @@
               <w14:ligatures w14:val="standardContextual"/>
             </w:rPr>
           </w:pPr>
-          <w:hyperlink w:anchor="_Toc243338260" w:history="1">
+          <w:hyperlink w:anchor="_Toc243895939" w:history="1">
             <w:r>
               <w:rPr>
                 <w:rStyle w:val="Hyperlink"/>
@@ -1416,7 +1428,7 @@
               <w:rPr>
                 <w:webHidden/>
               </w:rPr>
-              <w:instrText xml:space="preserve"> PAGEREF _Toc243338260 \h </w:instrText>
+              <w:instrText xml:space="preserve"> PAGEREF _Toc243895939 \h </w:instrText>
             </w:r>
             <w:r>
               <w:rPr>
@@ -1458,7 +1470,7 @@
               <w14:ligatures w14:val="standardContextual"/>
             </w:rPr>
           </w:pPr>
-          <w:hyperlink w:anchor="_Toc243338261" w:history="1">
+          <w:hyperlink w:anchor="_Toc243895940" w:history="1">
             <w:r>
               <w:rPr>
                 <w:rStyle w:val="Hyperlink"/>
@@ -1485,7 +1497,7 @@
                 <w:noProof/>
                 <w:webHidden/>
               </w:rPr>
-              <w:instrText xml:space="preserve"> PAGEREF _Toc243338261 \h </w:instrText>
+              <w:instrText xml:space="preserve"> PAGEREF _Toc243895940 \h </w:instrText>
             </w:r>
             <w:r>
               <w:rPr>
@@ -1531,7 +1543,7 @@
               <w14:ligatures w14:val="standardContextual"/>
             </w:rPr>
           </w:pPr>
-          <w:hyperlink w:anchor="_Toc243338262" w:history="1">
+          <w:hyperlink w:anchor="_Toc243895941" w:history="1">
             <w:r>
               <w:rPr>
                 <w:rStyle w:val="Hyperlink"/>
@@ -1558,7 +1570,7 @@
                 <w:noProof/>
                 <w:webHidden/>
               </w:rPr>
-              <w:instrText xml:space="preserve"> PAGEREF _Toc243338262 \h </w:instrText>
+              <w:instrText xml:space="preserve"> PAGEREF _Toc243895941 \h </w:instrText>
             </w:r>
             <w:r>
               <w:rPr>
@@ -1578,7 +1590,7 @@
                 <w:noProof/>
                 <w:webHidden/>
               </w:rPr>
-              <w:t>9</w:t>
+              <w:t>10</w:t>
             </w:r>
             <w:r>
               <w:rPr>
@@ -1604,7 +1616,7 @@
               <w14:ligatures w14:val="standardContextual"/>
             </w:rPr>
           </w:pPr>
-          <w:hyperlink w:anchor="_Toc243338263" w:history="1">
+          <w:hyperlink w:anchor="_Toc243895942" w:history="1">
             <w:r>
               <w:rPr>
                 <w:rStyle w:val="Hyperlink"/>
@@ -1631,7 +1643,7 @@
                 <w:noProof/>
                 <w:webHidden/>
               </w:rPr>
-              <w:instrText xml:space="preserve"> PAGEREF _Toc243338263 \h </w:instrText>
+              <w:instrText xml:space="preserve"> PAGEREF _Toc243895942 \h </w:instrText>
             </w:r>
             <w:r>
               <w:rPr>
@@ -1677,7 +1689,7 @@
               <w14:ligatures w14:val="standardContextual"/>
             </w:rPr>
           </w:pPr>
-          <w:hyperlink w:anchor="_Toc243338264" w:history="1">
+          <w:hyperlink w:anchor="_Toc243895943" w:history="1">
             <w:r>
               <w:rPr>
                 <w:rStyle w:val="Hyperlink"/>
@@ -1704,7 +1716,7 @@
                 <w:noProof/>
                 <w:webHidden/>
               </w:rPr>
-              <w:instrText xml:space="preserve"> PAGEREF _Toc243338264 \h </w:instrText>
+              <w:instrText xml:space="preserve"> PAGEREF _Toc243895943 \h </w:instrText>
             </w:r>
             <w:r>
               <w:rPr>
@@ -1750,7 +1762,7 @@
               <w14:ligatures w14:val="standardContextual"/>
             </w:rPr>
           </w:pPr>
-          <w:hyperlink w:anchor="_Toc243338265" w:history="1">
+          <w:hyperlink w:anchor="_Toc243895944" w:history="1">
             <w:r>
               <w:rPr>
                 <w:rStyle w:val="Hyperlink"/>
@@ -1777,7 +1789,7 @@
                 <w:noProof/>
                 <w:webHidden/>
               </w:rPr>
-              <w:instrText xml:space="preserve"> PAGEREF _Toc243338265 \h </w:instrText>
+              <w:instrText xml:space="preserve"> PAGEREF _Toc243895944 \h </w:instrText>
             </w:r>
             <w:r>
               <w:rPr>
@@ -1823,7 +1835,7 @@
               <w14:ligatures w14:val="standardContextual"/>
             </w:rPr>
           </w:pPr>
-          <w:hyperlink w:anchor="_Toc243338266" w:history="1">
+          <w:hyperlink w:anchor="_Toc243895945" w:history="1">
             <w:r>
               <w:rPr>
                 <w:rStyle w:val="Hyperlink"/>
@@ -1850,7 +1862,7 @@
                 <w:noProof/>
                 <w:webHidden/>
               </w:rPr>
-              <w:instrText xml:space="preserve"> PAGEREF _Toc243338266 \h </w:instrText>
+              <w:instrText xml:space="preserve"> PAGEREF _Toc243895945 \h </w:instrText>
             </w:r>
             <w:r>
               <w:rPr>
@@ -1896,7 +1908,7 @@
               <w14:ligatures w14:val="standardContextual"/>
             </w:rPr>
           </w:pPr>
-          <w:hyperlink w:anchor="_Toc243338267" w:history="1">
+          <w:hyperlink w:anchor="_Toc243895946" w:history="1">
             <w:r>
               <w:rPr>
                 <w:rStyle w:val="Hyperlink"/>
@@ -1923,7 +1935,7 @@
                 <w:noProof/>
                 <w:webHidden/>
               </w:rPr>
-              <w:instrText xml:space="preserve"> PAGEREF _Toc243338267 \h </w:instrText>
+              <w:instrText xml:space="preserve"> PAGEREF _Toc243895946 \h </w:instrText>
             </w:r>
             <w:r>
               <w:rPr>
@@ -1969,7 +1981,7 @@
               <w14:ligatures w14:val="standardContextual"/>
             </w:rPr>
           </w:pPr>
-          <w:hyperlink w:anchor="_Toc243338268" w:history="1">
+          <w:hyperlink w:anchor="_Toc243895947" w:history="1">
             <w:r>
               <w:rPr>
                 <w:rStyle w:val="Hyperlink"/>
@@ -1996,7 +2008,7 @@
                 <w:noProof/>
                 <w:webHidden/>
               </w:rPr>
-              <w:instrText xml:space="preserve"> PAGEREF _Toc243338268 \h </w:instrText>
+              <w:instrText xml:space="preserve"> PAGEREF _Toc243895947 \h </w:instrText>
             </w:r>
             <w:r>
               <w:rPr>
@@ -2016,7 +2028,7 @@
                 <w:noProof/>
                 <w:webHidden/>
               </w:rPr>
-              <w:t>11</w:t>
+              <w:t>12</w:t>
             </w:r>
             <w:r>
               <w:rPr>
@@ -2042,7 +2054,7 @@
               <w14:ligatures w14:val="standardContextual"/>
             </w:rPr>
           </w:pPr>
-          <w:hyperlink w:anchor="_Toc243338269" w:history="1">
+          <w:hyperlink w:anchor="_Toc243895948" w:history="1">
             <w:r>
               <w:rPr>
                 <w:rStyle w:val="Hyperlink"/>
@@ -2069,7 +2081,7 @@
                 <w:noProof/>
                 <w:webHidden/>
               </w:rPr>
-              <w:instrText xml:space="preserve"> PAGEREF _Toc243338269 \h </w:instrText>
+              <w:instrText xml:space="preserve"> PAGEREF _Toc243895948 \h </w:instrText>
             </w:r>
             <w:r>
               <w:rPr>
@@ -2113,7 +2125,7 @@
               <w14:ligatures w14:val="standardContextual"/>
             </w:rPr>
           </w:pPr>
-          <w:hyperlink w:anchor="_Toc243338270" w:history="1">
+          <w:hyperlink w:anchor="_Toc243895949" w:history="1">
             <w:r>
               <w:rPr>
                 <w:rStyle w:val="Hyperlink"/>
@@ -2136,7 +2148,7 @@
               <w:rPr>
                 <w:webHidden/>
               </w:rPr>
-              <w:instrText xml:space="preserve"> PAGEREF _Toc243338270 \h </w:instrText>
+              <w:instrText xml:space="preserve"> PAGEREF _Toc243895949 \h </w:instrText>
             </w:r>
             <w:r>
               <w:rPr>
@@ -2176,7 +2188,7 @@
               <w14:ligatures w14:val="standardContextual"/>
             </w:rPr>
           </w:pPr>
-          <w:hyperlink w:anchor="_Toc243338271" w:history="1">
+          <w:hyperlink w:anchor="_Toc243895950" w:history="1">
             <w:r>
               <w:rPr>
                 <w:rStyle w:val="Hyperlink"/>
@@ -2199,7 +2211,7 @@
               <w:rPr>
                 <w:webHidden/>
               </w:rPr>
-              <w:instrText xml:space="preserve"> PAGEREF _Toc243338271 \h </w:instrText>
+              <w:instrText xml:space="preserve"> PAGEREF _Toc243895950 \h </w:instrText>
             </w:r>
             <w:r>
               <w:rPr>
@@ -2255,7 +2267,7 @@
         <w:pStyle w:val="Ttulo1"/>
         <w:jc w:val="center"/>
       </w:pPr>
-      <w:bookmarkStart w:id="0" w:name="_Toc243338246"/>
+      <w:bookmarkStart w:id="0" w:name="_Toc243895925"/>
       <w:r>
         <w:lastRenderedPageBreak/>
         <w:t xml:space="preserve">1. </w:t>
@@ -2346,7 +2358,7 @@
         <w:pStyle w:val="Ttulo1"/>
         <w:jc w:val="center"/>
       </w:pPr>
-      <w:bookmarkStart w:id="1" w:name="_Toc243338247"/>
+      <w:bookmarkStart w:id="1" w:name="_Toc243895926"/>
       <w:r>
         <w:t xml:space="preserve">2. </w:t>
       </w:r>
@@ -2556,18 +2568,64 @@
     </w:p>
     <w:p>
       <w:pPr>
+        <w:spacing w:after="80" w:line="276" w:lineRule="auto"/>
+        <w:jc w:val="both"/>
+      </w:pPr>
+    </w:p>
+    <w:p>
+      <w:pPr>
         <w:pStyle w:val="Ttulo1"/>
         <w:jc w:val="center"/>
       </w:pPr>
-      <w:bookmarkStart w:id="2" w:name="_Toc243338248"/>
+      <w:bookmarkStart w:id="2" w:name="_Toc243895927"/>
       <w:r>
         <w:lastRenderedPageBreak/>
         <w:t>3</w:t>
       </w:r>
       <w:r>
+        <w:t xml:space="preserve">. </w:t>
+      </w:r>
+      <w:r>
+        <w:t>PERGUNTA DE PESQUISA</w:t>
+      </w:r>
+      <w:bookmarkEnd w:id="2"/>
+    </w:p>
+    <w:p>
+      <w:pPr>
+        <w:spacing w:after="80" w:line="276" w:lineRule="auto"/>
+        <w:ind w:firstLine="567"/>
+        <w:jc w:val="both"/>
+      </w:pPr>
+      <w:r>
+        <w:rPr>
+          <w:b/>
+          <w:bCs/>
+        </w:rPr>
+        <w:t>Pergunta principal:</w:t>
+      </w:r>
+      <w:r>
+        <w:t xml:space="preserve"> Em que medida um sistema web que combina OCR com métodos de recuperação de informação lexicais e semânticos</w:t>
+      </w:r>
+      <w:r>
+        <w:t xml:space="preserve"> </w:t>
+      </w:r>
+      <w:r>
+        <w:t>melhora a eficácia da recuperação de documentos perdidos em Angola?</w:t>
+      </w:r>
+    </w:p>
+    <w:p>
+      <w:pPr>
+        <w:pStyle w:val="Ttulo1"/>
+        <w:jc w:val="center"/>
+      </w:pPr>
+      <w:bookmarkStart w:id="3" w:name="_Toc243895928"/>
+      <w:r>
+        <w:t>4</w:t>
+      </w:r>
+      <w:r>
         <w:t>. HIPÓTESES</w:t>
       </w:r>
-      <w:bookmarkEnd w:id="2"/>
+      <w:bookmarkEnd w:id="3"/>
     </w:p>
     <w:p>
       <w:pPr>
@@ -2647,46 +2705,11 @@
     </w:p>
     <w:p>
       <w:pPr>
-        <w:spacing w:after="80" w:line="276" w:lineRule="auto"/>
+        <w:pStyle w:val="PargrafodaLista"/>
+        <w:spacing w:after="60" w:line="264" w:lineRule="auto"/>
+        <w:ind w:left="720"/>
         <w:jc w:val="both"/>
       </w:pPr>
-    </w:p>
-    <w:p>
-      <w:pPr>
-        <w:pStyle w:val="Ttulo1"/>
-        <w:jc w:val="center"/>
-      </w:pPr>
-      <w:bookmarkStart w:id="3" w:name="_Toc243338249"/>
-      <w:r>
-        <w:t xml:space="preserve">4. </w:t>
-      </w:r>
-      <w:r>
-        <w:t>PERGUNTA DE PESQUISA</w:t>
-      </w:r>
-      <w:bookmarkEnd w:id="3"/>
-    </w:p>
-    <w:p>
-      <w:pPr>
-        <w:spacing w:after="80" w:line="276" w:lineRule="auto"/>
-        <w:ind w:firstLine="567"/>
-        <w:jc w:val="both"/>
-      </w:pPr>
-      <w:r>
-        <w:rPr>
-          <w:b/>
-          <w:bCs/>
-        </w:rPr>
-        <w:t>Pergunta principal:</w:t>
-      </w:r>
-      <w:r>
-        <w:t xml:space="preserve"> Em que medida um sistema web que combina OCR com métodos de recuperação de informação lexicais e semânticos</w:t>
-      </w:r>
-      <w:r>
-        <w:t xml:space="preserve"> </w:t>
-      </w:r>
-      <w:r>
-        <w:t>melhora a eficácia da recuperação de documentos perdidos em Angola?</w:t>
-      </w:r>
     </w:p>
     <w:p>
       <w:pPr>
@@ -2835,11 +2858,24 @@
         <w:pStyle w:val="Ttulo1"/>
         <w:jc w:val="center"/>
       </w:pPr>
-      <w:bookmarkStart w:id="4" w:name="_Toc243338250"/>
-      <w:r>
-        <w:t>5. JUSTIFICATIVA</w:t>
+      <w:bookmarkStart w:id="4" w:name="_Toc243895929"/>
+      <w:r>
+        <w:t>5</w:t>
+      </w:r>
+      <w:r>
+        <w:t>. OBJETIVOS</w:t>
       </w:r>
       <w:bookmarkEnd w:id="4"/>
+    </w:p>
+    <w:p>
+      <w:pPr>
+        <w:pStyle w:val="Ttulo2"/>
+      </w:pPr>
+      <w:bookmarkStart w:id="5" w:name="_Toc243895930"/>
+      <w:r>
+        <w:t>6.1 Objetivo geral</w:t>
+      </w:r>
+      <w:bookmarkEnd w:id="5"/>
     </w:p>
     <w:p>
       <w:pPr>
@@ -2848,107 +2884,18 @@
         <w:jc w:val="both"/>
       </w:pPr>
       <w:r>
-        <w:t>Em Angola, o cidadão depende de um conjunto de documentos para aceder a serviços públicos e privados: o Bilhete de Identidade (BI), o passaporte, a carta de condução, o livrete e título de propriedade de viaturas, o cartão de contribuinte e até os cartões multicaixas. A perda ou o extravio de qualquer um deles obriga qualquer um a uma sequência de passos que podemos dizer complexos onde inclui a participação do extravio e o pedido de segunda via.</w:t>
-      </w:r>
-      <w:r>
-        <w:t xml:space="preserve"> </w:t>
-      </w:r>
-      <w:r>
-        <w:t xml:space="preserve">Nesse cenário, </w:t>
-      </w:r>
-      <w:r>
-        <w:t>o desenvolvimento e</w:t>
-      </w:r>
-      <w:r>
-        <w:t xml:space="preserve"> implementação d</w:t>
-      </w:r>
-      <w:r>
-        <w:t xml:space="preserve">o sistema </w:t>
-      </w:r>
-      <w:r>
-        <w:t>torn</w:t>
-      </w:r>
-      <w:r>
-        <w:t>a</w:t>
-      </w:r>
-      <w:r>
-        <w:t>-se uma prática essencial</w:t>
-      </w:r>
-      <w:r>
-        <w:t xml:space="preserve"> e “ind</w:t>
-      </w:r>
-      <w:r>
-        <w:t>i</w:t>
-      </w:r>
-      <w:r>
-        <w:t>spensavel”</w:t>
-      </w:r>
-      <w:r>
-        <w:t>, especialmente após o aumento d</w:t>
-      </w:r>
-      <w:r>
-        <w:t>o acesso a internet e as redes sociais comparados as gerações anteriores</w:t>
-      </w:r>
-    </w:p>
-    <w:p>
-      <w:pPr>
-        <w:pStyle w:val="Forte1"/>
-      </w:pPr>
-    </w:p>
-    <w:p>
-      <w:pPr>
-        <w:pStyle w:val="Forte1"/>
-      </w:pPr>
-    </w:p>
-    <w:p>
-      <w:pPr>
-        <w:pStyle w:val="Forte1"/>
-      </w:pPr>
-    </w:p>
-    <w:p>
-      <w:pPr>
-        <w:pStyle w:val="Ttulo1"/>
-        <w:jc w:val="center"/>
-      </w:pPr>
-      <w:bookmarkStart w:id="5" w:name="_Toc243338251"/>
-      <w:r>
-        <w:lastRenderedPageBreak/>
-        <w:t xml:space="preserve">6. </w:t>
-      </w:r>
-      <w:r>
-        <w:t>OBJETIVOS</w:t>
-      </w:r>
-      <w:bookmarkEnd w:id="5"/>
+        <w:t>Desenvolver um sistema web de recuperação de documentos perdidos, baseado em OCR e em recuperação de informação híbrida (lexical e semântica).</w:t>
+      </w:r>
     </w:p>
     <w:p>
       <w:pPr>
         <w:pStyle w:val="Ttulo2"/>
       </w:pPr>
-      <w:bookmarkStart w:id="6" w:name="_Toc243338252"/>
-      <w:r>
-        <w:t>6.1 Objetivo geral</w:t>
+      <w:bookmarkStart w:id="6" w:name="_Toc243895931"/>
+      <w:r>
+        <w:t>6.2 Objetivos específicos</w:t>
       </w:r>
       <w:bookmarkEnd w:id="6"/>
-    </w:p>
-    <w:p>
-      <w:pPr>
-        <w:spacing w:after="80" w:line="276" w:lineRule="auto"/>
-        <w:ind w:firstLine="567"/>
-        <w:jc w:val="both"/>
-      </w:pPr>
-      <w:r>
-        <w:t>Desenvolver um sistema web de recuperação de documentos perdidos, baseado em OCR e em recuperação de informação híbrida (lexical e semântica).</w:t>
-      </w:r>
-    </w:p>
-    <w:p>
-      <w:pPr>
-        <w:pStyle w:val="Ttulo2"/>
-      </w:pPr>
-      <w:bookmarkStart w:id="7" w:name="_Toc243338253"/>
-      <w:r>
-        <w:t>6.2 Objetivos específicos</w:t>
-      </w:r>
-      <w:bookmarkEnd w:id="7"/>
     </w:p>
     <w:p>
       <w:pPr>
@@ -2961,13 +2908,7 @@
         <w:jc w:val="both"/>
       </w:pPr>
       <w:r>
-        <w:t>Caracterizar o problema da perda e do achado de documentos, identificando tipos de documentos</w:t>
-      </w:r>
-      <w:r>
-        <w:t xml:space="preserve"> e </w:t>
-      </w:r>
-      <w:r>
-        <w:t>fluxos atuais.</w:t>
+        <w:t>Caracterizar o problema da perda e do achado de documentos, identificando tipos de documentos e fluxos atuais.</w:t>
       </w:r>
     </w:p>
     <w:p>
@@ -2981,19 +2922,7 @@
         <w:jc w:val="both"/>
       </w:pPr>
       <w:r>
-        <w:t>Comparar tecnologias candidatas (motores de OCR, linguagens de programação, bases de dados e abordagens de busca) e justificar a seleção d</w:t>
-      </w:r>
-      <w:r>
-        <w:t xml:space="preserve">o conjunto </w:t>
-      </w:r>
-      <w:r>
-        <w:t>tecnológic</w:t>
-      </w:r>
-      <w:r>
-        <w:t>o</w:t>
-      </w:r>
-      <w:r>
-        <w:t>.</w:t>
+        <w:t>Comparar tecnologias candidatas (motores de OCR, linguagens de programação, bases de dados e abordagens de busca) e justificar a seleção do conjunto tecnológico.</w:t>
       </w:r>
     </w:p>
     <w:p>
@@ -3012,17 +2941,26 @@
     </w:p>
     <w:p>
       <w:pPr>
+        <w:pStyle w:val="PargrafodaLista"/>
+        <w:spacing w:after="60" w:line="264" w:lineRule="auto"/>
+        <w:ind w:left="720"/>
+        <w:jc w:val="both"/>
+      </w:pPr>
+    </w:p>
+    <w:p>
+      <w:pPr>
         <w:pStyle w:val="Ttulo1"/>
         <w:jc w:val="center"/>
       </w:pPr>
-      <w:bookmarkStart w:id="8" w:name="_Toc243338254"/>
-      <w:r>
-        <w:t xml:space="preserve">7. </w:t>
-      </w:r>
-      <w:r>
-        <w:t>ESTUDO COMPARATIVO DAS TECNOLOGIAS</w:t>
-      </w:r>
-      <w:bookmarkEnd w:id="8"/>
+      <w:bookmarkStart w:id="7" w:name="_Toc243895932"/>
+      <w:r>
+        <w:lastRenderedPageBreak/>
+        <w:t>6</w:t>
+      </w:r>
+      <w:r>
+        <w:t>. JUSTIFICATIVA</w:t>
+      </w:r>
+      <w:bookmarkEnd w:id="7"/>
     </w:p>
     <w:p>
       <w:pPr>
@@ -3031,6 +2969,89 @@
         <w:jc w:val="both"/>
       </w:pPr>
       <w:r>
+        <w:t>Em Angola, o cidadão depende de um conjunto de documentos para aceder a serviços públicos e privados: o Bilhete de Identidade (BI), o passaporte, a carta de condução, o livrete e título de propriedade de viaturas, o cartão de contribuinte e até os cartões multicaixas. A perda ou o extravio de qualquer um deles obriga qualquer um a uma sequência de passos que podemos dizer complexos onde inclui a participação do extravio e o pedido de segunda via.</w:t>
+      </w:r>
+      <w:r>
+        <w:t xml:space="preserve"> </w:t>
+      </w:r>
+      <w:r>
+        <w:t xml:space="preserve">Nesse cenário, </w:t>
+      </w:r>
+      <w:r>
+        <w:t>o desenvolvimento e</w:t>
+      </w:r>
+      <w:r>
+        <w:t xml:space="preserve"> implementação d</w:t>
+      </w:r>
+      <w:r>
+        <w:t xml:space="preserve">o sistema </w:t>
+      </w:r>
+      <w:r>
+        <w:t>torn</w:t>
+      </w:r>
+      <w:r>
+        <w:t>a</w:t>
+      </w:r>
+      <w:r>
+        <w:t>-se uma prática essencial</w:t>
+      </w:r>
+      <w:r>
+        <w:t xml:space="preserve"> e “ind</w:t>
+      </w:r>
+      <w:r>
+        <w:t>i</w:t>
+      </w:r>
+      <w:r>
+        <w:t>spensavel”</w:t>
+      </w:r>
+      <w:r>
+        <w:t>, especialmente após o aumento d</w:t>
+      </w:r>
+      <w:r>
+        <w:t>o acesso a internet e as redes sociais comparados as gerações anteriores</w:t>
+      </w:r>
+    </w:p>
+    <w:p>
+      <w:pPr>
+        <w:pStyle w:val="Forte1"/>
+      </w:pPr>
+    </w:p>
+    <w:p>
+      <w:pPr>
+        <w:pStyle w:val="Forte1"/>
+      </w:pPr>
+    </w:p>
+    <w:p>
+      <w:pPr>
+        <w:pStyle w:val="Forte1"/>
+      </w:pPr>
+    </w:p>
+    <w:p>
+      <w:pPr>
+        <w:pStyle w:val="Forte1"/>
+      </w:pPr>
+    </w:p>
+    <w:p>
+      <w:pPr>
+        <w:pStyle w:val="Ttulo1"/>
+        <w:jc w:val="center"/>
+      </w:pPr>
+      <w:bookmarkStart w:id="8" w:name="_Toc243895933"/>
+      <w:r>
+        <w:t xml:space="preserve">7. </w:t>
+      </w:r>
+      <w:r>
+        <w:t>ESTUDO COMPARATIVO DAS TECNOLOGIAS</w:t>
+      </w:r>
+      <w:bookmarkEnd w:id="8"/>
+    </w:p>
+    <w:p>
+      <w:pPr>
+        <w:spacing w:after="80" w:line="276" w:lineRule="auto"/>
+        <w:ind w:firstLine="567"/>
+        <w:jc w:val="both"/>
+      </w:pPr>
+      <w:r>
         <w:t xml:space="preserve">Aqui iremos comparar as alternativas tecnológicas encontradas durante a pesquisa </w:t>
       </w:r>
       <w:r>
@@ -3056,7 +3077,7 @@
       <w:pPr>
         <w:pStyle w:val="Ttulo2"/>
       </w:pPr>
-      <w:bookmarkStart w:id="9" w:name="_Toc243338255"/>
+      <w:bookmarkStart w:id="9" w:name="_Toc243895934"/>
       <w:r>
         <w:t>7.1 Motores de OCR: Tesseract, EasyOCR, PaddleOCR e serviços em nuvem</w:t>
       </w:r>
@@ -4271,7 +4292,7 @@
       <w:pPr>
         <w:pStyle w:val="Ttulo2"/>
       </w:pPr>
-      <w:bookmarkStart w:id="10" w:name="_Toc243338256"/>
+      <w:bookmarkStart w:id="10" w:name="_Toc243895935"/>
       <w:r>
         <w:t>7.</w:t>
       </w:r>
@@ -5177,7 +5198,7 @@
       <w:pPr>
         <w:pStyle w:val="Ttulo2"/>
       </w:pPr>
-      <w:bookmarkStart w:id="11" w:name="_Toc243338257"/>
+      <w:bookmarkStart w:id="11" w:name="_Toc243895936"/>
       <w:r>
         <w:t>7.</w:t>
       </w:r>
@@ -6061,7 +6082,7 @@
       <w:pPr>
         <w:pStyle w:val="Ttulo2"/>
       </w:pPr>
-      <w:bookmarkStart w:id="12" w:name="_Toc243338258"/>
+      <w:bookmarkStart w:id="12" w:name="_Toc243895937"/>
       <w:r>
         <w:t xml:space="preserve">7.4 Bases de dados relacionais: PostgreSQL </w:t>
       </w:r>
@@ -6982,7 +7003,7 @@
         <w:pStyle w:val="Ttulo2"/>
       </w:pPr>
       <w:bookmarkStart w:id="13" w:name="_Toc243257178"/>
-      <w:bookmarkStart w:id="14" w:name="_Toc243338259"/>
+      <w:bookmarkStart w:id="14" w:name="_Toc243895938"/>
       <w:r>
         <w:lastRenderedPageBreak/>
         <w:t>7</w:t>
@@ -7866,7 +7887,7 @@
         <w:pStyle w:val="Ttulo1"/>
         <w:jc w:val="center"/>
       </w:pPr>
-      <w:bookmarkStart w:id="15" w:name="_Toc243338260"/>
+      <w:bookmarkStart w:id="15" w:name="_Toc243895939"/>
       <w:r>
         <w:t xml:space="preserve">8. </w:t>
       </w:r>
@@ -7896,7 +7917,7 @@
       <w:pPr>
         <w:pStyle w:val="Ttulo2"/>
       </w:pPr>
-      <w:bookmarkStart w:id="16" w:name="_Toc243338261"/>
+      <w:bookmarkStart w:id="16" w:name="_Toc243895940"/>
       <w:r>
         <w:t>8.1 Arquitetura geral</w:t>
       </w:r>
@@ -8649,10 +8670,16 @@
     </w:p>
     <w:p>
       <w:pPr>
+        <w:spacing w:after="120"/>
+      </w:pPr>
+    </w:p>
+    <w:p>
+      <w:pPr>
         <w:pStyle w:val="Ttulo2"/>
       </w:pPr>
-      <w:bookmarkStart w:id="17" w:name="_Toc243338262"/>
-      <w:r>
+      <w:bookmarkStart w:id="17" w:name="_Toc243895941"/>
+      <w:r>
+        <w:lastRenderedPageBreak/>
         <w:t xml:space="preserve">8.2 Frontend: HTML5, CSS3, JavaScript </w:t>
       </w:r>
       <w:r>
@@ -8717,11 +8744,7 @@
         <w:t>MediaDevices</w:t>
       </w:r>
       <w:r>
-        <w:t xml:space="preserve"> do </w:t>
-      </w:r>
-      <w:r>
-        <w:lastRenderedPageBreak/>
-        <w:t xml:space="preserve">navegador ou o elemento </w:t>
+        <w:t xml:space="preserve"> do navegador ou o elemento </w:t>
       </w:r>
       <w:r>
         <w:rPr>
@@ -8748,7 +8771,7 @@
       <w:pPr>
         <w:pStyle w:val="Ttulo2"/>
       </w:pPr>
-      <w:bookmarkStart w:id="18" w:name="_Toc243338263"/>
+      <w:bookmarkStart w:id="18" w:name="_Toc243895942"/>
       <w:r>
         <w:t>8.3 Backend: Python e FastAPI</w:t>
       </w:r>
@@ -8888,7 +8911,7 @@
       <w:pPr>
         <w:pStyle w:val="Ttulo2"/>
       </w:pPr>
-      <w:bookmarkStart w:id="19" w:name="_Toc243338264"/>
+      <w:bookmarkStart w:id="19" w:name="_Toc243895943"/>
       <w:r>
         <w:t>8.4 Pré-processamento de imagem: OpenCV e Pillow</w:t>
       </w:r>
@@ -9032,7 +9055,7 @@
       <w:pPr>
         <w:pStyle w:val="Ttulo2"/>
       </w:pPr>
-      <w:bookmarkStart w:id="20" w:name="_Toc243338265"/>
+      <w:bookmarkStart w:id="20" w:name="_Toc243895944"/>
       <w:r>
         <w:t>8.5 Reconhecimento ótico de caracteres: Tesseract e PaddleOCR</w:t>
       </w:r>
@@ -9085,6 +9108,7 @@
         <w:jc w:val="both"/>
       </w:pPr>
       <w:r>
+        <w:lastRenderedPageBreak/>
         <w:t>Para documentos com campos em posições conhecidas, como o BI, aplicam-se regiões de interesse (</w:t>
       </w:r>
       <w:r>
@@ -9095,11 +9119,7 @@
         <w:t>templates</w:t>
       </w:r>
       <w:r>
-        <w:t xml:space="preserve">) que isolam cada campo e o leem com um modo de segmentação de linha única. Isto reduz erros de segmentação. Em campos como números de documento, restringe-se </w:t>
-      </w:r>
-      <w:r>
-        <w:lastRenderedPageBreak/>
-        <w:t>o conjunto de caracteres aceites (</w:t>
+        <w:t>) que isolam cada campo e o leem com um modo de segmentação de linha única. Isto reduz erros de segmentação. Em campos como números de documento, restringe-se o conjunto de caracteres aceites (</w:t>
       </w:r>
       <w:r>
         <w:rPr>
@@ -9146,7 +9166,7 @@
       <w:pPr>
         <w:pStyle w:val="Ttulo2"/>
       </w:pPr>
-      <w:bookmarkStart w:id="21" w:name="_Toc243338266"/>
+      <w:bookmarkStart w:id="21" w:name="_Toc243895945"/>
       <w:r>
         <w:t>8.</w:t>
       </w:r>
@@ -9282,7 +9302,7 @@
       <w:pPr>
         <w:pStyle w:val="Ttulo2"/>
       </w:pPr>
-      <w:bookmarkStart w:id="22" w:name="_Toc243338267"/>
+      <w:bookmarkStart w:id="22" w:name="_Toc243895946"/>
       <w:r>
         <w:t>8.</w:t>
       </w:r>
@@ -9405,8 +9425,9 @@
       <w:pPr>
         <w:pStyle w:val="Ttulo2"/>
       </w:pPr>
-      <w:bookmarkStart w:id="23" w:name="_Toc243338268"/>
-      <w:r>
+      <w:bookmarkStart w:id="23" w:name="_Toc243895947"/>
+      <w:r>
+        <w:lastRenderedPageBreak/>
         <w:t>8.</w:t>
       </w:r>
       <w:r>
@@ -9444,11 +9465,7 @@
         <w:t>Docker Compose</w:t>
       </w:r>
       <w:r>
-        <w:t xml:space="preserve"> descreve e arranca o conjunto com um único comando, o que torna o ambiente de desenvolvimento igual ao de produção e facilita a instalação em servidores de </w:t>
-      </w:r>
-      <w:r>
-        <w:lastRenderedPageBreak/>
-        <w:t xml:space="preserve">instituições. O </w:t>
+        <w:t xml:space="preserve"> descreve e arranca o conjunto com um único comando, o que torna o ambiente de desenvolvimento igual ao de produção e facilita a instalação em servidores de instituições. O </w:t>
       </w:r>
       <w:r>
         <w:rPr>
@@ -9495,7 +9512,7 @@
       <w:pPr>
         <w:pStyle w:val="Ttulo2"/>
       </w:pPr>
-      <w:bookmarkStart w:id="24" w:name="_Toc243338269"/>
+      <w:bookmarkStart w:id="24" w:name="_Toc243895948"/>
       <w:r>
         <w:t>8.</w:t>
       </w:r>
@@ -9531,7 +9548,7 @@
         <w:pStyle w:val="Ttulo1"/>
         <w:jc w:val="center"/>
       </w:pPr>
-      <w:bookmarkStart w:id="25" w:name="_Toc243338270"/>
+      <w:bookmarkStart w:id="25" w:name="_Toc243895949"/>
       <w:r>
         <w:lastRenderedPageBreak/>
         <w:t>9</w:t>
@@ -9615,7 +9632,7 @@
         <w:pStyle w:val="Ttulo1"/>
         <w:jc w:val="center"/>
       </w:pPr>
-      <w:bookmarkStart w:id="26" w:name="_Toc243338271"/>
+      <w:bookmarkStart w:id="26" w:name="_Toc243895950"/>
       <w:r>
         <w:lastRenderedPageBreak/>
         <w:t>10</w:t>
@@ -10666,6 +10683,7 @@
   </w:style>
   <w:style w:type="paragraph" w:styleId="Ttulo2">
     <w:name w:val="heading 2"/>
+    <w:link w:val="Ttulo2Char"/>
     <w:uiPriority w:val="9"/>
     <w:unhideWhenUsed/>
     <w:qFormat/>
@@ -10740,6 +10758,7 @@
   <w:style w:type="character" w:default="1" w:styleId="Fontepargpadro">
     <w:name w:val="Default Paragraph Font"/>
     <w:uiPriority w:val="1"/>
+    <w:semiHidden/>
     <w:unhideWhenUsed/>
   </w:style>
   <w:style w:type="table" w:default="1" w:styleId="Tabelanormal">
@@ -10933,6 +10952,19 @@
     <w:rPr>
       <w:color w:val="605E5C"/>
       <w:shd w:val="clear" w:color="auto" w:fill="E1DFDD"/>
+    </w:rPr>
+  </w:style>
+  <w:style w:type="character" w:customStyle="1" w:styleId="Ttulo2Char">
+    <w:name w:val="Título 2 Char"/>
+    <w:basedOn w:val="Fontepargpadro"/>
+    <w:link w:val="Ttulo2"/>
+    <w:uiPriority w:val="9"/>
+    <w:rsid w:val="002B13DE"/>
+    <w:rPr>
+      <w:b/>
+      <w:bCs/>
+      <w:sz w:val="26"/>
+      <w:szCs w:val="26"/>
     </w:rPr>
   </w:style>
 </w:styles>

</xml_diff>